<commit_message>
Doc: IREB Name Correction
</commit_message>
<xml_diff>
--- a/Parcial 1/IREB_Proyectos_Informe_Borrador1.docx
+++ b/Parcial 1/IREB_Proyectos_Informe_Borrador1.docx
@@ -166,23 +166,29 @@
           <w:szCs w:val="24"/>
         </w:rPr>
       </w:pPr>
-      <w:proofErr w:type="spellStart"/>
       <w:r>
         <w:rPr>
           <w:rFonts w:ascii="Sans Serif Collection" w:hAnsi="Sans Serif Collection" w:cs="Sans Serif Collection"/>
           <w:sz w:val="24"/>
           <w:szCs w:val="24"/>
         </w:rPr>
-        <w:t>Frias</w:t>
+        <w:t>Frías</w:t>
       </w:r>
-      <w:proofErr w:type="spellEnd"/>
       <w:r>
         <w:rPr>
           <w:rFonts w:ascii="Sans Serif Collection" w:hAnsi="Sans Serif Collection" w:cs="Sans Serif Collection"/>
           <w:sz w:val="24"/>
           <w:szCs w:val="24"/>
         </w:rPr>
-        <w:t xml:space="preserve"> Valverde Pether Pedro</w:t>
+        <w:t xml:space="preserve"> Valverde Pedro</w:t>
+      </w:r>
+      <w:r>
+        <w:rPr>
+          <w:rFonts w:ascii="Sans Serif Collection" w:hAnsi="Sans Serif Collection" w:cs="Sans Serif Collection"/>
+          <w:sz w:val="24"/>
+          <w:szCs w:val="24"/>
+        </w:rPr>
+        <w:t xml:space="preserve"> Antonio</w:t>
       </w:r>
     </w:p>
     <w:p>
@@ -14251,21 +14257,6 @@
         </w:rPr>
         <w:lastRenderedPageBreak/>
         <w:t>4. RECOMENDACIONES</w:t>
-      </w:r>
-    </w:p>
-    <w:p>
-      <w:pPr>
-        <w:spacing w:after="120" w:line="276" w:lineRule="auto"/>
-        <w:jc w:val="both"/>
-        <w:rPr>
-          <w:rFonts w:ascii="Sans Serif Collection" w:hAnsi="Sans Serif Collection" w:cs="Sans Serif Collection"/>
-        </w:rPr>
-      </w:pPr>
-      <w:r>
-        <w:rPr>
-          <w:rFonts w:ascii="Sans Serif Collection" w:hAnsi="Sans Serif Collection" w:cs="Sans Serif Collection"/>
-        </w:rPr>
-        <w:t>Una fila por cada pregunta respondida NO en la lista de comprobación. Agregue o elimine filas según los resultados.</w:t>
       </w:r>
     </w:p>
     <w:p>

</xml_diff>